<commit_message>
Form numara çakışması giderildi: Tela Proses Kontrol 03.11, Kalibrasyon Kartı 03.12
Co-Authored-By: Claude Sonnet 5.5 <noreply@anthropic.com>
Claude-Session: https://claude.ai/code/session_01J6foNXTwf1dGzDjULYpfrk
</commit_message>
<xml_diff>
--- a/prosedurler/EMS.LB.PRO.09.02. Calibration of Measuring Equipment Procedure.docx
+++ b/prosedurler/EMS.LB.PRO.09.02. Calibration of Measuring Equipment Procedure.docx
@@ -1517,7 +1517,7 @@
           <w:sz w:val="24"/>
           <w:szCs w:val="24"/>
         </w:rPr>
-        <w:t xml:space="preserve">Internal Verification Forms; EMS.QA.FRM.03.07 Metal Detector Daily Calibration Card</w:t>
+        <w:t xml:space="preserve">Internal Verification Forms; EMS.QA.FRM.03.12 Metal Detector Daily Calibration Card</w:t>
       </w:r>
     </w:p>
     <w:p>
@@ -3336,7 +3336,7 @@
           <w:sz w:val="24"/>
           <w:szCs w:val="24"/>
         </w:rPr>
-        <w:t xml:space="preserve">نماذج التحقق الداخلي؛ EMS.QA.FRM.03.07 بطاقة المعايرة اليومية لكاشف المعادن</w:t>
+        <w:t xml:space="preserve">نماذج التحقق الداخلي؛ EMS.QA.FRM.03.12 بطاقة المعايرة اليومية لكاشف المعادن</w:t>
       </w:r>
     </w:p>
     <w:p>

</xml_diff>